<commit_message>
Refactor MOU templates to use placeholders for hospital and service names
- Updated Ambulance MOU to replace specific names with placeholders for {HOSPITAL_NAME}, {AMBULANCE_NAME}, and {AMBULANCE_ADDRESS}.
- Modified Blood Bank MOU to use placeholders for {HOSPITAL_NAME} and {BLOOD_BANK_NAME} along with their addresses.
- Revised Canteen MOU to include placeholders for {HOSPITAL_NAME} and {CANTEEN_NAME} with respective addresses.
- Adjusted Emergency MOU to implement placeholders for {HOSPITAL_NAME} and {EMERGENCY_NAME} with addresses.
- Altered Lab MOU to replace specific names with {LAB_NAME} and {LAB_ADDRESS}.
- Updated Radio MOU to use placeholders for {HOSPITAL_NAME}, {RADIO_NAME}, and {RADIO_ADDRESS}.
- Deleted main.docx as it was no longer needed.
- Added new Dry Cleaners MOU template.
- Generated new ambulance MOU document.
</commit_message>
<xml_diff>
--- a/App/mou_templates/Ambulance.docx
+++ b/App/mou_templates/Ambulance.docx
@@ -1,6 +1,6 @@
 
 <file path=word/document.xml><?xml version="1.0" encoding="utf-8"?>
-<w:document xmlns:wpc="http://schemas.microsoft.com/office/word/2010/wordprocessingCanvas" xmlns:cx="http://schemas.microsoft.com/office/drawing/2014/chartex" xmlns:cx1="http://schemas.microsoft.com/office/drawing/2015/9/8/chartex" xmlns:cx2="http://schemas.microsoft.com/office/drawing/2015/10/21/chartex" xmlns:cx3="http://schemas.microsoft.com/office/drawing/2016/5/9/chartex" xmlns:cx4="http://schemas.microsoft.com/office/drawing/2016/5/10/chartex" xmlns:cx5="http://schemas.microsoft.com/office/drawing/2016/5/11/chartex" xmlns:cx6="http://schemas.microsoft.com/office/drawing/2016/5/12/chartex" xmlns:cx7="http://schemas.microsoft.com/office/drawing/2016/5/13/chartex" xmlns:cx8="http://schemas.microsoft.com/office/drawing/2016/5/14/chartex" xmlns:mc="http://schemas.openxmlformats.org/markup-compatibility/2006" xmlns:aink="http://schemas.microsoft.com/office/drawing/2016/ink" xmlns:am3d="http://schemas.microsoft.com/office/drawing/2017/model3d" xmlns:o="urn:schemas-microsoft-com:office:office" xmlns:oel="http://schemas.microsoft.com/office/2019/extlst" xmlns:r="http://schemas.openxmlformats.org/officeDocument/2006/relationships" xmlns:m="http://schemas.openxmlformats.org/officeDocument/2006/math" xmlns:v="urn:schemas-microsoft-com:vml" xmlns:wp14="http://schemas.microsoft.com/office/word/2010/wordprocessingDrawing" xmlns:wp="http://schemas.openxmlformats.org/drawingml/2006/wordprocessingDrawing" xmlns:w10="urn:schemas-microsoft-com:office:word" xmlns:w="http://schemas.openxmlformats.org/wordprocessingml/2006/main" xmlns:w14="http://schemas.microsoft.com/office/word/2010/wordml" xmlns:w15="http://schemas.microsoft.com/office/word/2012/wordml" xmlns:w16cei="http://schemas.microsoft.com/office/word/2026/wordml/cei" xmlns:w16cex="http://schemas.microsoft.com/office/word/2018/wordml/cex" xmlns:w16cid="http://schemas.microsoft.com/office/word/2016/wordml/cid" xmlns:w16="http://schemas.microsoft.com/office/word/2018/wordml" xmlns:w16du="http://schemas.microsoft.com/office/word/2023/wordml/word16du" xmlns:w16sdtdh="http://schemas.microsoft.com/office/word/2020/wordml/sdtdatahash" xmlns:w16sdtfl="http://schemas.microsoft.com/office/word/2024/wordml/sdtformatlock" xmlns:w16se="http://schemas.microsoft.com/office/word/2015/wordml/symex" xmlns:wpg="http://schemas.microsoft.com/office/word/2010/wordprocessingGroup" xmlns:wpi="http://schemas.microsoft.com/office/word/2010/wordprocessingInk" xmlns:wne="http://schemas.microsoft.com/office/word/2006/wordml" xmlns:wps="http://schemas.microsoft.com/office/word/2010/wordprocessingShape" mc:Ignorable="w14 w15 w16se w16cid w16 w16cex w16sdtdh w16sdtfl w16du wp14">
+<w:document xmlns:wpc="http://schemas.microsoft.com/office/word/2010/wordprocessingCanvas" xmlns:cx="http://schemas.microsoft.com/office/drawing/2014/chartex" xmlns:cx1="http://schemas.microsoft.com/office/drawing/2015/9/8/chartex" xmlns:cx2="http://schemas.microsoft.com/office/drawing/2015/10/21/chartex" xmlns:cx3="http://schemas.microsoft.com/office/drawing/2016/5/9/chartex" xmlns:cx4="http://schemas.microsoft.com/office/drawing/2016/5/10/chartex" xmlns:cx5="http://schemas.microsoft.com/office/drawing/2016/5/11/chartex" xmlns:cx6="http://schemas.microsoft.com/office/drawing/2016/5/12/chartex" xmlns:cx7="http://schemas.microsoft.com/office/drawing/2016/5/13/chartex" xmlns:cx8="http://schemas.microsoft.com/office/drawing/2016/5/14/chartex" xmlns:mc="http://schemas.openxmlformats.org/markup-compatibility/2006" xmlns:aink="http://schemas.microsoft.com/office/drawing/2016/ink" xmlns:am3d="http://schemas.microsoft.com/office/drawing/2017/model3d" xmlns:o="urn:schemas-microsoft-com:office:office" xmlns:oel="http://schemas.microsoft.com/office/2019/extlst" xmlns:r="http://schemas.openxmlformats.org/officeDocument/2006/relationships" xmlns:m="http://schemas.openxmlformats.org/officeDocument/2006/math" xmlns:v="urn:schemas-microsoft-com:vml" xmlns:wp14="http://schemas.microsoft.com/office/word/2010/wordprocessingDrawing" xmlns:wp="http://schemas.openxmlformats.org/drawingml/2006/wordprocessingDrawing" xmlns:w10="urn:schemas-microsoft-com:office:word" xmlns:w="http://schemas.openxmlformats.org/wordprocessingml/2006/main" xmlns:w14="http://schemas.microsoft.com/office/word/2010/wordml" xmlns:w15="http://schemas.microsoft.com/office/word/2012/wordml" xmlns:w16cex="http://schemas.microsoft.com/office/word/2018/wordml/cex" xmlns:w16cid="http://schemas.microsoft.com/office/word/2016/wordml/cid" xmlns:w16="http://schemas.microsoft.com/office/word/2018/wordml" xmlns:w16du="http://schemas.microsoft.com/office/word/2023/wordml/word16du" xmlns:w16sdtdh="http://schemas.microsoft.com/office/word/2020/wordml/sdtdatahash" xmlns:w16sdtfl="http://schemas.microsoft.com/office/word/2024/wordml/sdtformatlock" xmlns:w16se="http://schemas.microsoft.com/office/word/2015/wordml/symex" xmlns:wpg="http://schemas.microsoft.com/office/word/2010/wordprocessingGroup" xmlns:wpi="http://schemas.microsoft.com/office/word/2010/wordprocessingInk" xmlns:wne="http://schemas.microsoft.com/office/word/2006/wordml" xmlns:wps="http://schemas.microsoft.com/office/word/2010/wordprocessingShape" mc:Ignorable="w14 w15 w16se w16cid w16 w16cex w16sdtdh w16sdtfl w16du wp14">
   <w:body>
     <w:p>
       <w:pPr>
@@ -182,15 +182,7 @@
         <w:t>This is MOU is executed at-</w:t>
       </w:r>
       <w:r>
-        <w:t>{</w:t>
-      </w:r>
-      <w:proofErr w:type="spellStart"/>
-      <w:r>
-        <w:t>hospital_name</w:t>
-      </w:r>
-      <w:proofErr w:type="spellEnd"/>
-      <w:r>
-        <w:t>}</w:t>
+        <w:t>{HOSPITAL_NAME}</w:t>
       </w:r>
       <w:r>
         <w:rPr>
@@ -248,23 +240,7 @@
           <w:b/>
           <w:bCs/>
         </w:rPr>
-        <w:t>{</w:t>
-      </w:r>
-      <w:proofErr w:type="spellStart"/>
-      <w:r>
-        <w:rPr>
-          <w:b/>
-          <w:bCs/>
-        </w:rPr>
-        <w:t>ambulance_name</w:t>
-      </w:r>
-      <w:proofErr w:type="spellEnd"/>
-      <w:r>
-        <w:rPr>
-          <w:b/>
-          <w:bCs/>
-        </w:rPr>
-        <w:t>}</w:t>
+        <w:t>{AMBULANCE_NAME}</w:t>
       </w:r>
       <w:r>
         <w:rPr>
@@ -290,15 +266,11 @@
         <w:jc w:val="both"/>
       </w:pPr>
       <w:r>
-        <w:t>{</w:t>
-      </w:r>
-      <w:proofErr w:type="spellStart"/>
-      <w:r>
-        <w:t>hospital_name</w:t>
-      </w:r>
-      <w:proofErr w:type="spellEnd"/>
-      <w:r>
-        <w:t>}</w:t>
+        <w:rPr>
+          <w:b/>
+          <w:bCs/>
+        </w:rPr>
+        <w:t>{HOSPITAL_NAME}</w:t>
       </w:r>
       <w:r>
         <w:rPr>
@@ -308,39 +280,37 @@
         <w:t xml:space="preserve"> </w:t>
       </w:r>
       <w:r>
-        <w:rPr>
-          <w:b/>
-          <w:bCs/>
-        </w:rPr>
+        <w:t xml:space="preserve">Having its HOSPITAL at </w:t>
+      </w:r>
+      <w:r>
+        <w:rPr>
+          <w:b/>
+          <w:bCs/>
+          <w:u w:val="single"/>
+        </w:rPr>
+        <w:t>{HOSPITAL_</w:t>
+      </w:r>
+      <w:proofErr w:type="gramStart"/>
+      <w:r>
+        <w:rPr>
+          <w:b/>
+          <w:bCs/>
+          <w:u w:val="single"/>
+        </w:rPr>
+        <w:t>ADDRESS}</w:t>
+      </w:r>
+      <w:r>
         <w:t xml:space="preserve"> </w:t>
       </w:r>
       <w:r>
-        <w:t xml:space="preserve">Having its HOSPITAL at </w:t>
-      </w:r>
-      <w:r>
-        <w:rPr>
-          <w:b/>
-          <w:bCs/>
-          <w:u w:val="single"/>
-        </w:rPr>
-        <w:t>NEAR PAC CAMP BICHHIYA, GORAKHPUR, UTTAR PRADESH 273014</w:t>
-      </w:r>
-      <w:r>
-        <w:rPr>
-          <w:b/>
-          <w:bCs/>
-          <w:u w:val="single"/>
-        </w:rPr>
-        <w:t xml:space="preserve"> </w:t>
-      </w:r>
-      <w:r>
-        <w:t xml:space="preserve">represented by </w:t>
-      </w:r>
-      <w:r>
-        <w:t xml:space="preserve">Ram Prakash Yadav </w:t>
-      </w:r>
-      <w:r>
-        <w:t>(hereinafter referred to us “</w:t>
+        <w:t xml:space="preserve"> by</w:t>
+      </w:r>
+      <w:proofErr w:type="gramEnd"/>
+      <w:r>
+        <w:t xml:space="preserve"> ________________________</w:t>
+      </w:r>
+      <w:r>
+        <w:t xml:space="preserve"> (hereinafter referred to us “</w:t>
       </w:r>
       <w:r>
         <w:rPr>
@@ -847,379 +817,303 @@
           <w:b/>
           <w:bCs/>
         </w:rPr>
+        <w:t>{AMBULANCE_NAME}</w:t>
+      </w:r>
+    </w:p>
+    <w:p>
+      <w:pPr>
+        <w:spacing w:after="0"/>
+        <w:rPr>
+          <w:b/>
+          <w:bCs/>
+        </w:rPr>
+      </w:pPr>
+      <w:r>
+        <w:rPr>
+          <w:b/>
+          <w:bCs/>
+        </w:rPr>
+        <w:t xml:space="preserve">Termination  </w:t>
+      </w:r>
+    </w:p>
+    <w:p>
+      <w:pPr>
+        <w:spacing w:after="0"/>
+        <w:jc w:val="both"/>
+      </w:pPr>
+      <w:r>
+        <w:t xml:space="preserve">Either </w:t>
+      </w:r>
+      <w:r>
+        <w:rPr>
+          <w:b/>
+          <w:bCs/>
+        </w:rPr>
+        <w:t>{AMBULANCE_NAME}</w:t>
+      </w:r>
+      <w:r>
+        <w:t>/</w:t>
+      </w:r>
+      <w:r>
+        <w:t>{HOSPITAL_NAME}</w:t>
+      </w:r>
+      <w:r>
+        <w:rPr>
+          <w:b/>
+          <w:bCs/>
+        </w:rPr>
+        <w:t xml:space="preserve">. </w:t>
+      </w:r>
+      <w:r>
+        <w:t>shall have the right to terminate this arrangement by giving 30 days prior notice in writing to the other without assigning any reason.</w:t>
+      </w:r>
+    </w:p>
+    <w:p>
+      <w:pPr>
+        <w:spacing w:after="0"/>
+        <w:jc w:val="both"/>
+      </w:pPr>
+      <w:r>
+        <w:t xml:space="preserve">Upon termination or expiry of this Agreement as aforesaid, each Party shall immediately pay to the other, the full </w:t>
+      </w:r>
+      <w:proofErr w:type="gramStart"/>
+      <w:r>
+        <w:t>amount</w:t>
+      </w:r>
+      <w:proofErr w:type="gramEnd"/>
+      <w:r>
+        <w:t xml:space="preserve"> of monies then due to the other as per the provisions of this Agreement within 15 (fifteen) days of such termination.</w:t>
+      </w:r>
+    </w:p>
+    <w:p>
+      <w:pPr>
+        <w:spacing w:after="0"/>
+        <w:rPr>
+          <w:b/>
+          <w:bCs/>
+        </w:rPr>
+      </w:pPr>
+      <w:r>
+        <w:rPr>
+          <w:b/>
+          <w:bCs/>
+        </w:rPr>
+        <w:t>Governing law and dispute resolution</w:t>
+      </w:r>
+    </w:p>
+    <w:p>
+      <w:pPr>
+        <w:spacing w:after="0"/>
+        <w:jc w:val="both"/>
+      </w:pPr>
+      <w:r>
+        <w:t xml:space="preserve">The provision and implementation of this MOU shall </w:t>
+      </w:r>
+      <w:proofErr w:type="gramStart"/>
+      <w:r>
+        <w:t>governed</w:t>
+      </w:r>
+      <w:proofErr w:type="gramEnd"/>
+      <w:r>
+        <w:t xml:space="preserve"> by the laws of republic of India.</w:t>
+      </w:r>
+    </w:p>
+    <w:p>
+      <w:pPr>
+        <w:spacing w:after="0"/>
+        <w:jc w:val="both"/>
+      </w:pPr>
+    </w:p>
+    <w:p>
+      <w:pPr>
+        <w:spacing w:after="0"/>
+        <w:jc w:val="both"/>
+      </w:pPr>
+      <w:r>
+        <w:t xml:space="preserve">All any disputes, claims arising out of this arrangement but could not be settled by means of dispute resolution meeting shall be resolved by means of arbitration by submitting the dispute for the arbitration of mutually agreed sole arbitrator in accordance with the arbitration and conciliation Act 1996 as amended or reconstituted from time to time and the proceeding of arbitration shall be conduct at Gorakhpur, Uttar Pradesh, India English Language.  </w:t>
+      </w:r>
+    </w:p>
+    <w:p>
+      <w:pPr>
+        <w:spacing w:after="0"/>
+      </w:pPr>
+    </w:p>
+    <w:p>
+      <w:pPr>
+        <w:spacing w:after="0"/>
+      </w:pPr>
+      <w:r>
+        <w:t xml:space="preserve">IN WITNESS </w:t>
+      </w:r>
+      <w:proofErr w:type="gramStart"/>
+      <w:r>
+        <w:t>WHERE</w:t>
+      </w:r>
+      <w:proofErr w:type="gramEnd"/>
+      <w:r>
+        <w:t xml:space="preserve"> OF, the parties here to have caused this Agreement to be executed as of the date written below by their duly authorized representatives.</w:t>
+      </w:r>
+    </w:p>
+    <w:p>
+      <w:pPr>
+        <w:spacing w:after="0"/>
+      </w:pPr>
+    </w:p>
+    <w:p>
+      <w:pPr>
+        <w:spacing w:after="0"/>
+      </w:pPr>
+    </w:p>
+    <w:p>
+      <w:pPr>
+        <w:spacing w:after="0"/>
+      </w:pPr>
+      <w:r>
+        <w:t>Signed and delivered by the within named</w:t>
+      </w:r>
+    </w:p>
+    <w:p>
+      <w:pPr>
+        <w:spacing w:after="0"/>
+      </w:pPr>
+    </w:p>
+    <w:p>
+      <w:pPr>
+        <w:spacing w:after="0"/>
+        <w:ind w:left="-851" w:firstLine="851"/>
+        <w:rPr>
+          <w:b/>
+          <w:bCs/>
+        </w:rPr>
+      </w:pPr>
+      <w:r>
+        <w:t>For and on behalf of:</w:t>
+      </w:r>
+      <w:r>
+        <w:t xml:space="preserve"> </w:t>
+      </w:r>
+      <w:r>
+        <w:t>{HOSPITAL_NAME}</w:t>
+      </w:r>
+      <w:r>
+        <w:rPr>
+          <w:b/>
+          <w:bCs/>
+        </w:rPr>
+        <w:t>.</w:t>
+      </w:r>
+    </w:p>
+    <w:p>
+      <w:pPr>
+        <w:spacing w:after="0"/>
+      </w:pPr>
+    </w:p>
+    <w:p>
+      <w:pPr>
+        <w:spacing w:after="0"/>
+      </w:pPr>
+      <w:r>
+        <w:t xml:space="preserve">Through: Name &amp; Designation                                          </w:t>
+      </w:r>
+    </w:p>
+    <w:p>
+      <w:pPr>
+        <w:spacing w:after="0"/>
+      </w:pPr>
+    </w:p>
+    <w:p>
+      <w:pPr>
+        <w:spacing w:after="0"/>
+      </w:pPr>
+    </w:p>
+    <w:p>
+      <w:pPr>
+        <w:spacing w:after="0"/>
+      </w:pPr>
+      <w:r>
+        <w:t xml:space="preserve">Sign: -                                          </w:t>
+      </w:r>
+    </w:p>
+    <w:p>
+      <w:pPr>
+        <w:spacing w:after="0"/>
+      </w:pPr>
+    </w:p>
+    <w:p>
+      <w:pPr>
+        <w:spacing w:after="0"/>
+      </w:pPr>
+    </w:p>
+    <w:p>
+      <w:pPr>
+        <w:spacing w:after="0"/>
+        <w:ind w:left="-851" w:firstLine="851"/>
+        <w:rPr>
+          <w:b/>
+          <w:bCs/>
+        </w:rPr>
+      </w:pPr>
+      <w:r>
+        <w:t xml:space="preserve">For and on behalf </w:t>
+      </w:r>
+      <w:proofErr w:type="gramStart"/>
+      <w:r>
+        <w:t xml:space="preserve">of </w:t>
+      </w:r>
+      <w:r>
+        <w:rPr>
+          <w:b/>
+          <w:bCs/>
+        </w:rPr>
+        <w:t xml:space="preserve"> </w:t>
+      </w:r>
+      <w:r>
+        <w:rPr>
+          <w:b/>
+          <w:bCs/>
+        </w:rPr>
         <w:t>{</w:t>
       </w:r>
-      <w:proofErr w:type="spellStart"/>
-      <w:r>
-        <w:rPr>
-          <w:b/>
-          <w:bCs/>
-        </w:rPr>
-        <w:t>ambulance_name</w:t>
-      </w:r>
-      <w:proofErr w:type="spellEnd"/>
-      <w:r>
-        <w:rPr>
-          <w:b/>
-          <w:bCs/>
-        </w:rPr>
-        <w:t>}</w:t>
-      </w:r>
-    </w:p>
-    <w:p>
-      <w:pPr>
-        <w:spacing w:after="0"/>
-        <w:rPr>
-          <w:b/>
-          <w:bCs/>
-        </w:rPr>
-      </w:pPr>
-      <w:r>
-        <w:rPr>
-          <w:b/>
-          <w:bCs/>
-        </w:rPr>
-        <w:t xml:space="preserve">Termination  </w:t>
-      </w:r>
-    </w:p>
-    <w:p>
-      <w:pPr>
-        <w:spacing w:after="0"/>
-        <w:jc w:val="both"/>
-      </w:pPr>
-      <w:r>
-        <w:t xml:space="preserve">Either </w:t>
-      </w:r>
-      <w:r>
-        <w:rPr>
-          <w:b/>
-          <w:bCs/>
-        </w:rPr>
-        <w:t xml:space="preserve">Shree </w:t>
-      </w:r>
-      <w:proofErr w:type="spellStart"/>
-      <w:r>
-        <w:rPr>
-          <w:b/>
-          <w:bCs/>
-        </w:rPr>
-        <w:t>bala</w:t>
-      </w:r>
-      <w:proofErr w:type="spellEnd"/>
-      <w:r>
-        <w:rPr>
-          <w:b/>
-          <w:bCs/>
-        </w:rPr>
-        <w:t xml:space="preserve"> ji</w:t>
-      </w:r>
-      <w:r>
-        <w:t>/</w:t>
-      </w:r>
-      <w:r>
-        <w:t>{HOSPITAL_NAME}</w:t>
-      </w:r>
-      <w:r>
-        <w:rPr>
-          <w:b/>
-          <w:bCs/>
-        </w:rPr>
-        <w:t xml:space="preserve">. </w:t>
-      </w:r>
-      <w:r>
-        <w:t>shall have the right to terminate this arrangement by giving 30 days prior notice in writing to the other without assigning any reason.</w:t>
-      </w:r>
-    </w:p>
-    <w:p>
-      <w:pPr>
-        <w:spacing w:after="0"/>
-        <w:jc w:val="both"/>
-      </w:pPr>
-      <w:r>
-        <w:t xml:space="preserve">Upon termination or expiry of this Agreement as aforesaid, each Party shall immediately pay to the other, the full </w:t>
+      <w:proofErr w:type="gramEnd"/>
+      <w:r>
+        <w:rPr>
+          <w:b/>
+          <w:bCs/>
+        </w:rPr>
+        <w:t>AMBULANCE_NAME}</w:t>
+      </w:r>
+      <w:r>
+        <w:rPr>
+          <w:b/>
+          <w:bCs/>
+        </w:rPr>
+        <w:t xml:space="preserve"> </w:t>
       </w:r>
       <w:proofErr w:type="gramStart"/>
       <w:r>
-        <w:t>amount</w:t>
+        <w:rPr>
+          <w:b/>
+          <w:bCs/>
+        </w:rPr>
+        <w:t>service  Gorakhpur</w:t>
       </w:r>
       <w:proofErr w:type="gramEnd"/>
-      <w:r>
-        <w:t xml:space="preserve"> of monies then due to the other as per the provisions of this Agreement within 15 (fifteen) days of such termination.</w:t>
-      </w:r>
-    </w:p>
-    <w:p>
-      <w:pPr>
-        <w:spacing w:after="0"/>
-        <w:rPr>
-          <w:b/>
-          <w:bCs/>
-        </w:rPr>
-      </w:pPr>
-      <w:r>
-        <w:rPr>
-          <w:b/>
-          <w:bCs/>
-        </w:rPr>
-        <w:t>Governing law and dispute resolution</w:t>
-      </w:r>
-    </w:p>
-    <w:p>
-      <w:pPr>
-        <w:spacing w:after="0"/>
-        <w:jc w:val="both"/>
-      </w:pPr>
-      <w:r>
-        <w:t xml:space="preserve">The provision and implementation of this MOU shall </w:t>
-      </w:r>
+    </w:p>
+    <w:p>
+      <w:pPr>
+        <w:spacing w:after="0"/>
+      </w:pPr>
       <w:proofErr w:type="gramStart"/>
       <w:r>
-        <w:t>governed</w:t>
+        <w:t>Add.-</w:t>
       </w:r>
       <w:proofErr w:type="gramEnd"/>
       <w:r>
-        <w:t xml:space="preserve"> by the laws of republic of India.</w:t>
-      </w:r>
-    </w:p>
-    <w:p>
-      <w:pPr>
-        <w:spacing w:after="0"/>
-        <w:jc w:val="both"/>
-      </w:pPr>
-    </w:p>
-    <w:p>
-      <w:pPr>
-        <w:spacing w:after="0"/>
-        <w:jc w:val="both"/>
-      </w:pPr>
-      <w:r>
-        <w:t xml:space="preserve">All any disputes, claims arising out of this arrangement but could not be settled by means of dispute resolution meeting shall be resolved by means of arbitration by submitting the dispute for the arbitration of mutually agreed sole arbitrator in accordance with the arbitration and conciliation Act 1996 as amended or reconstituted from time to time and the proceeding of arbitration shall be conduct at Gorakhpur, Uttar Pradesh, India English Language.  </w:t>
-      </w:r>
-    </w:p>
-    <w:p>
-      <w:pPr>
-        <w:spacing w:after="0"/>
-      </w:pPr>
-    </w:p>
-    <w:p>
-      <w:pPr>
-        <w:spacing w:after="0"/>
-      </w:pPr>
-      <w:r>
-        <w:t xml:space="preserve">IN WITNESS </w:t>
-      </w:r>
-      <w:proofErr w:type="gramStart"/>
-      <w:r>
-        <w:t>WHERE</w:t>
-      </w:r>
-      <w:proofErr w:type="gramEnd"/>
-      <w:r>
-        <w:t xml:space="preserve"> OF, the parties here to have caused this Agreement to be executed as of the date written below by their duly authorized representatives.</w:t>
-      </w:r>
-    </w:p>
-    <w:p>
-      <w:pPr>
-        <w:spacing w:after="0"/>
-      </w:pPr>
-    </w:p>
-    <w:p>
-      <w:pPr>
-        <w:spacing w:after="0"/>
-      </w:pPr>
-    </w:p>
-    <w:p>
-      <w:pPr>
-        <w:spacing w:after="0"/>
-      </w:pPr>
-      <w:r>
-        <w:t>Signed and delivered by the within named</w:t>
-      </w:r>
-    </w:p>
-    <w:p>
-      <w:pPr>
-        <w:spacing w:after="0"/>
-      </w:pPr>
-    </w:p>
-    <w:p>
-      <w:pPr>
-        <w:spacing w:after="0"/>
-        <w:ind w:left="-851" w:firstLine="851"/>
-        <w:rPr>
-          <w:b/>
-          <w:bCs/>
-        </w:rPr>
-      </w:pPr>
-      <w:r>
-        <w:t>For and on behalf of:</w:t>
-      </w:r>
-      <w:r>
-        <w:t xml:space="preserve"> </w:t>
-      </w:r>
-      <w:r>
-        <w:t>{HOSPITAL_NAME}</w:t>
-      </w:r>
-      <w:r>
-        <w:rPr>
-          <w:b/>
-          <w:bCs/>
-        </w:rPr>
-        <w:t>.</w:t>
-      </w:r>
-    </w:p>
-    <w:p>
-      <w:pPr>
-        <w:spacing w:after="0"/>
-      </w:pPr>
-    </w:p>
-    <w:p>
-      <w:pPr>
-        <w:spacing w:after="0"/>
-      </w:pPr>
-      <w:r>
-        <w:t xml:space="preserve">Through: Name &amp; Designation                                          </w:t>
-      </w:r>
-    </w:p>
-    <w:p>
-      <w:pPr>
-        <w:spacing w:after="0"/>
-      </w:pPr>
-    </w:p>
-    <w:p>
-      <w:pPr>
-        <w:spacing w:after="0"/>
-      </w:pPr>
-    </w:p>
-    <w:p>
-      <w:pPr>
-        <w:spacing w:after="0"/>
-      </w:pPr>
-      <w:r>
-        <w:t xml:space="preserve">Sign: -                                          </w:t>
-      </w:r>
-    </w:p>
-    <w:p>
-      <w:pPr>
-        <w:spacing w:after="0"/>
-      </w:pPr>
-    </w:p>
-    <w:p>
-      <w:pPr>
-        <w:spacing w:after="0"/>
-      </w:pPr>
-    </w:p>
-    <w:p>
-      <w:pPr>
-        <w:spacing w:after="0"/>
-        <w:ind w:left="-851" w:firstLine="851"/>
-        <w:rPr>
-          <w:b/>
-          <w:bCs/>
-        </w:rPr>
-      </w:pPr>
-      <w:r>
-        <w:t xml:space="preserve">For and on behalf </w:t>
-      </w:r>
-      <w:proofErr w:type="gramStart"/>
-      <w:r>
-        <w:t xml:space="preserve">of </w:t>
-      </w:r>
-      <w:r>
-        <w:rPr>
-          <w:b/>
-          <w:bCs/>
-        </w:rPr>
-        <w:t xml:space="preserve"> Shree</w:t>
-      </w:r>
-      <w:proofErr w:type="gramEnd"/>
-      <w:r>
-        <w:rPr>
-          <w:b/>
-          <w:bCs/>
-        </w:rPr>
-        <w:t xml:space="preserve"> </w:t>
-      </w:r>
-      <w:proofErr w:type="spellStart"/>
-      <w:r>
-        <w:rPr>
-          <w:b/>
-          <w:bCs/>
-        </w:rPr>
-        <w:t>bala</w:t>
-      </w:r>
-      <w:proofErr w:type="spellEnd"/>
-      <w:r>
-        <w:rPr>
-          <w:b/>
-          <w:bCs/>
-        </w:rPr>
-        <w:t xml:space="preserve"> ji All </w:t>
-      </w:r>
-      <w:proofErr w:type="spellStart"/>
-      <w:r>
-        <w:rPr>
-          <w:b/>
-          <w:bCs/>
-        </w:rPr>
-        <w:t>india</w:t>
-      </w:r>
-      <w:proofErr w:type="spellEnd"/>
-      <w:r>
-        <w:rPr>
-          <w:b/>
-          <w:bCs/>
-        </w:rPr>
-        <w:t xml:space="preserve"> ambulance </w:t>
-      </w:r>
-      <w:proofErr w:type="gramStart"/>
-      <w:r>
-        <w:rPr>
-          <w:b/>
-          <w:bCs/>
-        </w:rPr>
-        <w:t>service  Gorakhpur</w:t>
-      </w:r>
-      <w:proofErr w:type="gramEnd"/>
-    </w:p>
-    <w:p>
-      <w:pPr>
-        <w:spacing w:after="0"/>
-      </w:pPr>
-      <w:proofErr w:type="gramStart"/>
-      <w:r>
-        <w:t>Add.-</w:t>
-      </w:r>
-      <w:proofErr w:type="gramEnd"/>
-      <w:r>
-        <w:t xml:space="preserve">  Near </w:t>
-      </w:r>
-      <w:proofErr w:type="spellStart"/>
-      <w:r>
-        <w:t>Sbi</w:t>
-      </w:r>
-      <w:proofErr w:type="spellEnd"/>
-      <w:r>
-        <w:t xml:space="preserve"> </w:t>
-      </w:r>
-      <w:proofErr w:type="spellStart"/>
-      <w:r>
-        <w:t>jonal</w:t>
-      </w:r>
-      <w:proofErr w:type="spellEnd"/>
-      <w:r>
-        <w:t xml:space="preserve"> office </w:t>
-      </w:r>
-      <w:proofErr w:type="spellStart"/>
-      <w:r>
-        <w:t>tramandal</w:t>
-      </w:r>
-      <w:proofErr w:type="spellEnd"/>
-      <w:r>
-        <w:t xml:space="preserve"> </w:t>
-      </w:r>
-      <w:proofErr w:type="spellStart"/>
-      <w:r>
-        <w:t>gorakhpur</w:t>
-      </w:r>
-      <w:proofErr w:type="spellEnd"/>
+        <w:t xml:space="preserve">  </w:t>
+      </w:r>
+      <w:r>
+        <w:t>{AMBULANCE_ADDRESS}</w:t>
+      </w:r>
     </w:p>
     <w:p>
       <w:pPr>
@@ -1286,7 +1180,7 @@
 </file>
 
 <file path=word/numbering.xml><?xml version="1.0" encoding="utf-8"?>
-<w:numbering xmlns:wpc="http://schemas.microsoft.com/office/word/2010/wordprocessingCanvas" xmlns:cx="http://schemas.microsoft.com/office/drawing/2014/chartex" xmlns:cx1="http://schemas.microsoft.com/office/drawing/2015/9/8/chartex" xmlns:cx2="http://schemas.microsoft.com/office/drawing/2015/10/21/chartex" xmlns:cx3="http://schemas.microsoft.com/office/drawing/2016/5/9/chartex" xmlns:cx4="http://schemas.microsoft.com/office/drawing/2016/5/10/chartex" xmlns:cx5="http://schemas.microsoft.com/office/drawing/2016/5/11/chartex" xmlns:cx6="http://schemas.microsoft.com/office/drawing/2016/5/12/chartex" xmlns:cx7="http://schemas.microsoft.com/office/drawing/2016/5/13/chartex" xmlns:cx8="http://schemas.microsoft.com/office/drawing/2016/5/14/chartex" xmlns:mc="http://schemas.openxmlformats.org/markup-compatibility/2006" xmlns:aink="http://schemas.microsoft.com/office/drawing/2016/ink" xmlns:am3d="http://schemas.microsoft.com/office/drawing/2017/model3d" xmlns:o="urn:schemas-microsoft-com:office:office" xmlns:oel="http://schemas.microsoft.com/office/2019/extlst" xmlns:r="http://schemas.openxmlformats.org/officeDocument/2006/relationships" xmlns:m="http://schemas.openxmlformats.org/officeDocument/2006/math" xmlns:v="urn:schemas-microsoft-com:vml" xmlns:wp14="http://schemas.microsoft.com/office/word/2010/wordprocessingDrawing" xmlns:wp="http://schemas.openxmlformats.org/drawingml/2006/wordprocessingDrawing" xmlns:w10="urn:schemas-microsoft-com:office:word" xmlns:w="http://schemas.openxmlformats.org/wordprocessingml/2006/main" xmlns:w14="http://schemas.microsoft.com/office/word/2010/wordml" xmlns:w15="http://schemas.microsoft.com/office/word/2012/wordml" xmlns:w16cei="http://schemas.microsoft.com/office/word/2026/wordml/cei" xmlns:w16cex="http://schemas.microsoft.com/office/word/2018/wordml/cex" xmlns:w16cid="http://schemas.microsoft.com/office/word/2016/wordml/cid" xmlns:w16="http://schemas.microsoft.com/office/word/2018/wordml" xmlns:w16du="http://schemas.microsoft.com/office/word/2023/wordml/word16du" xmlns:w16sdtdh="http://schemas.microsoft.com/office/word/2020/wordml/sdtdatahash" xmlns:w16sdtfl="http://schemas.microsoft.com/office/word/2024/wordml/sdtformatlock" xmlns:w16se="http://schemas.microsoft.com/office/word/2015/wordml/symex" xmlns:wpg="http://schemas.microsoft.com/office/word/2010/wordprocessingGroup" xmlns:wpi="http://schemas.microsoft.com/office/word/2010/wordprocessingInk" xmlns:wne="http://schemas.microsoft.com/office/word/2006/wordml" xmlns:wps="http://schemas.microsoft.com/office/word/2010/wordprocessingShape" mc:Ignorable="w14 w15 w16se w16cid w16 w16cex w16sdtdh w16sdtfl w16du wp14">
+<w:numbering xmlns:wpc="http://schemas.microsoft.com/office/word/2010/wordprocessingCanvas" xmlns:cx="http://schemas.microsoft.com/office/drawing/2014/chartex" xmlns:cx1="http://schemas.microsoft.com/office/drawing/2015/9/8/chartex" xmlns:cx2="http://schemas.microsoft.com/office/drawing/2015/10/21/chartex" xmlns:cx3="http://schemas.microsoft.com/office/drawing/2016/5/9/chartex" xmlns:cx4="http://schemas.microsoft.com/office/drawing/2016/5/10/chartex" xmlns:cx5="http://schemas.microsoft.com/office/drawing/2016/5/11/chartex" xmlns:cx6="http://schemas.microsoft.com/office/drawing/2016/5/12/chartex" xmlns:cx7="http://schemas.microsoft.com/office/drawing/2016/5/13/chartex" xmlns:cx8="http://schemas.microsoft.com/office/drawing/2016/5/14/chartex" xmlns:mc="http://schemas.openxmlformats.org/markup-compatibility/2006" xmlns:aink="http://schemas.microsoft.com/office/drawing/2016/ink" xmlns:am3d="http://schemas.microsoft.com/office/drawing/2017/model3d" xmlns:o="urn:schemas-microsoft-com:office:office" xmlns:oel="http://schemas.microsoft.com/office/2019/extlst" xmlns:r="http://schemas.openxmlformats.org/officeDocument/2006/relationships" xmlns:m="http://schemas.openxmlformats.org/officeDocument/2006/math" xmlns:v="urn:schemas-microsoft-com:vml" xmlns:wp14="http://schemas.microsoft.com/office/word/2010/wordprocessingDrawing" xmlns:wp="http://schemas.openxmlformats.org/drawingml/2006/wordprocessingDrawing" xmlns:w10="urn:schemas-microsoft-com:office:word" xmlns:w="http://schemas.openxmlformats.org/wordprocessingml/2006/main" xmlns:w14="http://schemas.microsoft.com/office/word/2010/wordml" xmlns:w15="http://schemas.microsoft.com/office/word/2012/wordml" xmlns:w16cex="http://schemas.microsoft.com/office/word/2018/wordml/cex" xmlns:w16cid="http://schemas.microsoft.com/office/word/2016/wordml/cid" xmlns:w16="http://schemas.microsoft.com/office/word/2018/wordml" xmlns:w16du="http://schemas.microsoft.com/office/word/2023/wordml/word16du" xmlns:w16sdtdh="http://schemas.microsoft.com/office/word/2020/wordml/sdtdatahash" xmlns:w16sdtfl="http://schemas.microsoft.com/office/word/2024/wordml/sdtformatlock" xmlns:w16se="http://schemas.microsoft.com/office/word/2015/wordml/symex" xmlns:wpg="http://schemas.microsoft.com/office/word/2010/wordprocessingGroup" xmlns:wpi="http://schemas.microsoft.com/office/word/2010/wordprocessingInk" xmlns:wne="http://schemas.microsoft.com/office/word/2006/wordml" xmlns:wps="http://schemas.microsoft.com/office/word/2010/wordprocessingShape" mc:Ignorable="w14 w15 w16se w16cid w16 w16cex w16sdtdh w16sdtfl w16du wp14">
   <w:abstractNum w:abstractNumId="0" w15:restartNumberingAfterBreak="0">
     <w:nsid w:val="587F59E4"/>
     <w:multiLevelType w:val="multilevel"/>

</xml_diff>

<commit_message>
fix: Update contract dates from August to September 2026 for consistency across templates
</commit_message>
<xml_diff>
--- a/App/mou_templates/Ambulance.docx
+++ b/App/mou_templates/Ambulance.docx
@@ -221,7 +221,14 @@
           <w:b/>
           <w:bCs/>
         </w:rPr>
-        <w:t xml:space="preserve"> August</w:t>
+        <w:t xml:space="preserve"> </w:t>
+      </w:r>
+      <w:r>
+        <w:rPr>
+          <w:b/>
+          <w:bCs/>
+        </w:rPr>
+        <w:t>September</w:t>
       </w:r>
       <w:r>
         <w:rPr>
@@ -288,24 +295,14 @@
           <w:bCs/>
           <w:u w:val="single"/>
         </w:rPr>
-        <w:t>{HOSPITAL_</w:t>
-      </w:r>
-      <w:proofErr w:type="gramStart"/>
-      <w:r>
-        <w:rPr>
-          <w:b/>
-          <w:bCs/>
-          <w:u w:val="single"/>
-        </w:rPr>
-        <w:t>ADDRESS}</w:t>
+        <w:t>{HOSPITAL_ADDRESS}</w:t>
       </w:r>
       <w:r>
         <w:t xml:space="preserve"> </w:t>
       </w:r>
       <w:r>
-        <w:t xml:space="preserve"> by</w:t>
-      </w:r>
-      <w:proofErr w:type="gramEnd"/>
+        <w:t>by</w:t>
+      </w:r>
       <w:r>
         <w:t xml:space="preserve"> ________________________</w:t>
       </w:r>
@@ -653,7 +650,7 @@
         <w:t>Validity of contract: The above offer &amp; special rates are valid till 31/0</w:t>
       </w:r>
       <w:r>
-        <w:t>7</w:t>
+        <w:t>8</w:t>
       </w:r>
       <w:r>
         <w:rPr>

</xml_diff>